<commit_message>
Complete peer-review revision pass (Asim, 2026): claim scope tightening, GVAR/DFM/BVAR framing, initial window expansion details, CRPS coverage contextualization, and cover letter alignment
</commit_message>
<xml_diff>
--- a/paper/manuscript.docx
+++ b/paper/manuscript.docx
@@ -82,7 +82,7 @@
         </m:r>
       </m:oMath>
       <w:r>
-        <w:t xml:space="preserve">), GNNs using the identity graph consistently achieve lower point-forecast error than any trade-based variant, and no trade-graph model achieves majority-seed significance against formally estimated parametric baselines, assessed using formal statistical testing with multiple-seed reproducibility confirmation. These findings suggest that temporal recurrence, rather than trade-network topology, is the more plausible source of any GNN forecast gains within this design — though the absence of architecture-specific tuning means this cannot be fully isolated. For the forecasting community, this negative result establishes that spatial or network-based models should not be assumed to capture meaningful economic spillovers without passing an identity-graph ablation control. This highlights the risk of over-parameterisation in network-based macroeconomic forecasting and underscores the need for rigorous architectural controls.</w:t>
+        <w:t xml:space="preserve">), GNNs using the identity graph consistently achieve lower point-forecast error than any trade-based variant, and no trade-graph model achieves majority-seed significance against formally estimated parametric baselines, assessed using formal statistical testing with multiple-seed reproducibility confirmation. This pattern is consistent with the hypothesis that temporal recurrence, rather than trade-network topology, is the primary source of any GNN forecast gains within this design — though because hyperparameters are held uniform across architectures, this remains an associational interpretation rather than a proven causal identification. For macroeconomic forecasters, this negative result demonstrates the necessity of identity-graph controls when evaluating spatial GNNs, highlighting the risk of assuming network spillovers without controlling for graph-agnostic architectural capacity.</w:t>
       </w:r>
     </w:p>
     <w:p>
@@ -1119,7 +1119,7 @@
         <w:t xml:space="preserve"> </w:t>
       </w:r>
       <w:r>
-        <w:t xml:space="preserve">Pesaran, Schuermann, and Weiner (2004) introduce a multinational VAR in which each country model is linked to a trade-weighted foreign aggregate, directly encoding bilateral trade-intensity as a structural prior. GVAR is the natural classical predecessor to GNN-based bilateral-trade forecasting: it operationalises the same economic intuition — that inflation co-movement tracks trade intensity — in a linear, statistically tractable framework.</w:t>
+        <w:t xml:space="preserve">Pesaran, Schuermann, and Weiner (2004) introduce a multinational VAR in which each country model is linked to a trade-weighted foreign aggregate, directly encoding bilateral trade-intensity as a structural prior. GVAR is the natural classical predecessor to GNN-based bilateral-trade forecasting: it operationalises the same economic intuition — that inflation co-movement tracks trade intensity — in a linear, statistically tractable framework. While full GVAR estimation with trade-weighted foreign aggregates serves as a standard spatial macro baseline, in our minimal 4-variable covariate setting, the Dynamic Factor Model (DFM) and Minnesota-prior Bayesian VAR (BVAR) fulfill the equivalent benchmark role.</w:t>
       </w:r>
     </w:p>
     <w:p>
@@ -1155,7 +1155,7 @@
         <w:t xml:space="preserve"> </w:t>
       </w:r>
       <w:r>
-        <w:t xml:space="preserve">Stock and Watson (2002) and Forni, Hallin, Lippi, and Reichlin (2000) show that a small number of common factors can capture the bulk of cross-country inflation co-movement. Factor models effectively impose the assumption that spillovers are symmetric and driven by global shocks rather than bilateral linkages. The present benchmark includes a Dynamic Factor Model (one common factor) precisely as a non-network cross-country comparator: any GNN gain over the DFM would suggest that bilateral network structure adds value beyond simple common-factor co-movement (see §4.2).</w:t>
+        <w:t xml:space="preserve">Stock and Watson (2002) and Forni, Hallin, Lippi, and Reichlin (2000) show that a small number of common factors can capture the bulk of cross-country inflation co-movement. Factor models effectively impose the assumption that spillovers are symmetric and driven by global shocks rather than bilateral linkages. The present benchmark includes a Dynamic Factor Model (one common factor) alongside a Minnesota-prior BVAR precisely as non-network cross-country comparators: any GNN gain over the DFM or BVAR would suggest that bilateral network structure adds value beyond simple common-factor co-movement or regularised multivariate dynamics (see §4.2).</w:t>
       </w:r>
     </w:p>
     <w:p>
@@ -1937,7 +1937,7 @@
         <w:t xml:space="preserve"> </w:t>
       </w:r>
       <w:r>
-        <w:t xml:space="preserve">by one quarter. This design aligns with the information constraints of a</w:t>
+        <w:t xml:space="preserve">by one quarter. As the evaluation progresses through the 35-quarter test period (2017Q1–2025Q3), the training window expands from 14 quarters initially to 45 quarters at the final test origin (and up to 57 quarters total over the full sample). This design aligns with the information constraints of a</w:t>
       </w:r>
       <w:r>
         <w:t xml:space="preserve"> </w:t>
@@ -1975,13 +1975,13 @@
         <w:t xml:space="preserve"> </w:t>
       </w:r>
       <w:r>
-        <w:t xml:space="preserve">systematically undertrained. This structural asymmetry is acknowledged</w:t>
-      </w:r>
-      <w:r>
-        <w:t xml:space="preserve"> </w:t>
-      </w:r>
-      <w:r>
-        <w:t xml:space="preserve">explicitly in the limitations (Section 6.4).</w:t>
+        <w:t xml:space="preserve">systematically undertrained. Parameter estimation instability in short initial macro windows is an inherent trade-off in macroeconomic panels with post-2011 sample boundaries. This structural constraint is acknowledged</w:t>
+      </w:r>
+      <w:r>
+        <w:t xml:space="preserve"> </w:t>
+      </w:r>
+      <w:r>
+        <w:t xml:space="preserve">explicitly in the limitations (Section 6.5).</w:t>
       </w:r>
     </w:p>
     <w:bookmarkEnd w:id="18"/>
@@ -8635,25 +8635,7 @@
         <w:t xml:space="preserve"> </w:t>
       </w:r>
       <w:r>
-        <w:t xml:space="preserve">level for all models (target 0.80; observed 0.50–0.58), consistent with</w:t>
-      </w:r>
-      <w:r>
-        <w:t xml:space="preserve"> </w:t>
-      </w:r>
-      <w:r>
-        <w:t xml:space="preserve">the short panel and bootstrap-based interval construction typical for</w:t>
-      </w:r>
-      <w:r>
-        <w:t xml:space="preserve"> </w:t>
-      </w:r>
-      <w:r>
-        <w:t xml:space="preserve">neural network ensembles in this setting. Calibration improvements</w:t>
-      </w:r>
-      <w:r>
-        <w:t xml:space="preserve"> </w:t>
-      </w:r>
-      <w:r>
-        <w:t xml:space="preserve">represent a clear avenue for future work.</w:t>
+        <w:t xml:space="preserve">level for all models (target 0.80; observed 0.50–0.58), reflecting systemic post-2020 macroeconomic volatility and under-estimation of tail risk across all 13 model families rather than a failure specific to GNN architectures. In short macro panels evaluated across unprecedented pandemic and energy shock regimes, bootstrap-based prediction intervals built on historical residual variance systematically understate out-of-sample prediction uncertainty. Calibration improvements represent a clear avenue for future work.</w:t>
       </w:r>
     </w:p>
     <w:bookmarkEnd w:id="26"/>
@@ -11673,19 +11655,13 @@
         <w:pStyle w:val="FirstParagraph"/>
       </w:pPr>
       <w:r>
-        <w:t xml:space="preserve">These findings carry methodological implications: identity-graph</w:t>
-      </w:r>
-      <w:r>
-        <w:t xml:space="preserve"> </w:t>
-      </w:r>
-      <w:r>
-        <w:t xml:space="preserve">ablation should be a standard requirement in GNN macroeconomic</w:t>
-      </w:r>
-      <w:r>
-        <w:t xml:space="preserve"> </w:t>
-      </w:r>
-      <w:r>
-        <w:t xml:space="preserve">forecasting papers; multi-seed reporting should replace single-seed</w:t>
+        <w:t xml:space="preserve">These findings carry practical implications for macroeconomic forecasters: identity-graph</w:t>
+      </w:r>
+      <w:r>
+        <w:t xml:space="preserve"> </w:t>
+      </w:r>
+      <w:r>
+        <w:t xml:space="preserve">ablation should be a standard requirement when evaluating spatial GNNs; multi-seed reporting should replace single-seed</w:t>
       </w:r>
       <w:r>
         <w:t xml:space="preserve"> </w:t>

</xml_diff>

<commit_message>
Clarify Figure 3 caption: specify GCN leads among GNN architectures at h=1 (narrowly behind overall leader ARIMA) and update model family count to 13
</commit_message>
<xml_diff>
--- a/paper/manuscript.docx
+++ b/paper/manuscript.docx
@@ -10796,7 +10796,7 @@
         <w:t xml:space="preserve"> </w:t>
       </w:r>
       <w:r>
-        <w:t xml:space="preserve">quarters) for all 12</w:t>
+        <w:t xml:space="preserve">quarters) for all 13</w:t>
       </w:r>
       <w:r>
         <w:t xml:space="preserve"> </w:t>
@@ -10826,7 +10826,7 @@
         <w:t xml:space="preserve"> = 4</w:t>
       </w:r>
       <w:r>
-        <w:t xml:space="preserve">, while GCN leads at</w:t>
+        <w:t xml:space="preserve">, while GCN leads among GNN architectures at</w:t>
       </w:r>
       <w:r>
         <w:t xml:space="preserve"> </w:t>
@@ -10838,7 +10838,10 @@
         <w:t xml:space="preserve"> = 1</w:t>
       </w:r>
       <w:r>
-        <w:t xml:space="preserve">.</w:t>
+        <w:t xml:space="preserve"> </w:t>
+      </w:r>
+      <w:r>
+        <w:t xml:space="preserve">(narrowly behind overall benchmark leader ARIMA).</w:t>
       </w:r>
     </w:p>
     <w:p>

</xml_diff>